<commit_message>
stabilize auth notifications and credentials
</commit_message>
<xml_diff>
--- a/docs/FeedWatch_클라우드_설치설명서.docx
+++ b/docs/FeedWatch_클라우드_설치설명서.docx
@@ -2346,7 +2346,7 @@
               <w:pStyle w:val="Cell"/>
             </w:pPr>
             <w:r>
-              <w:t xml:space="preserve">(로그인 사이트용) 웹에서 정한 '수집 비밀번호'와 동일하게</w:t>
+              <w:t xml:space="preserve">(로그인 사이트·비공개 네이버 카페용) 웹에서 정한 '수집 비밀번호'와 동일하게</w:t>
             </w:r>
           </w:p>
         </w:tc>
@@ -2442,7 +2442,7 @@
         <w:t xml:space="preserve">ℹ️ 참고  </w:t>
       </w:r>
       <w:r>
-        <w:t xml:space="preserve">로그인이 필요한 사이트의 아이디/비밀번호는 웹 관리자(URL 관리)에서 직접 입력합니다. 최초 1회 '수집 비밀번호'를 정하면 브라우저가 그 비밀번호로 암호화해 저장하고, 크롤러는 같은 값(위 FEEDWATCH_CRED_PASSPHRASE)으로 복호화합니다. 평문은 어디에도 저장되지 않습니다.</w:t>
+        <w:t xml:space="preserve">로그인이 필요한 사이트의 아이디/비밀번호와 비공개 네이버 카페의 로그인 쿠키는 웹 관리자(URL 관리)에서 직접 입력합니다. 최초 1회 '수집 비밀번호'를 정하면 브라우저가 그 값으로 암호화해 저장하고, 크롤러는 같은 값(위 FEEDWATCH_CRED_PASSPHRASE)으로 복호화합니다. 평문은 어디에도 저장되지 않습니다.</w:t>
       </w:r>
     </w:p>
     <w:p>
@@ -2456,7 +2456,7 @@
         <w:t xml:space="preserve">ℹ️ 참고  </w:t>
       </w:r>
       <w:r>
-        <w:t xml:space="preserve">메일이 실제로 나가려면 앱의 관리 → 설정 → ‘이메일 발송 방식’이 ‘자동(크롤러 환경설정 사용)’ 이어야 합니다. ‘미리보기’로 두면 파일만 만들고 발송하지 않습니다.</w:t>
+        <w:t xml:space="preserve">메일이 실제로 나가려면 앱의 관리 → 설정 → ‘이메일 발송 방식’이 ‘자동(크롤러 환경설정 사용)’ 이어야 합니다. ‘미리보기’로 두면 파일만 만들고 발송하지 않습니다. SMTP가 일시적으로 실패하면 발송 작업을 남겨 다음 크롤링 때 자동으로 다시 시도합니다.</w:t>
       </w:r>
     </w:p>
     <w:p>

</xml_diff>

<commit_message>
stabilize auth notifications and credentials (#1)
Co-authored-by: ws20220403 <svoffice@yuhs.ac>
</commit_message>
<xml_diff>
--- a/docs/FeedWatch_클라우드_설치설명서.docx
+++ b/docs/FeedWatch_클라우드_설치설명서.docx
@@ -2346,7 +2346,7 @@
               <w:pStyle w:val="Cell"/>
             </w:pPr>
             <w:r>
-              <w:t xml:space="preserve">(로그인 사이트용) 웹에서 정한 '수집 비밀번호'와 동일하게</w:t>
+              <w:t xml:space="preserve">(로그인 사이트·비공개 네이버 카페용) 웹에서 정한 '수집 비밀번호'와 동일하게</w:t>
             </w:r>
           </w:p>
         </w:tc>
@@ -2442,7 +2442,7 @@
         <w:t xml:space="preserve">ℹ️ 참고  </w:t>
       </w:r>
       <w:r>
-        <w:t xml:space="preserve">로그인이 필요한 사이트의 아이디/비밀번호는 웹 관리자(URL 관리)에서 직접 입력합니다. 최초 1회 '수집 비밀번호'를 정하면 브라우저가 그 비밀번호로 암호화해 저장하고, 크롤러는 같은 값(위 FEEDWATCH_CRED_PASSPHRASE)으로 복호화합니다. 평문은 어디에도 저장되지 않습니다.</w:t>
+        <w:t xml:space="preserve">로그인이 필요한 사이트의 아이디/비밀번호와 비공개 네이버 카페의 로그인 쿠키는 웹 관리자(URL 관리)에서 직접 입력합니다. 최초 1회 '수집 비밀번호'를 정하면 브라우저가 그 값으로 암호화해 저장하고, 크롤러는 같은 값(위 FEEDWATCH_CRED_PASSPHRASE)으로 복호화합니다. 평문은 어디에도 저장되지 않습니다.</w:t>
       </w:r>
     </w:p>
     <w:p>
@@ -2456,7 +2456,7 @@
         <w:t xml:space="preserve">ℹ️ 참고  </w:t>
       </w:r>
       <w:r>
-        <w:t xml:space="preserve">메일이 실제로 나가려면 앱의 관리 → 설정 → ‘이메일 발송 방식’이 ‘자동(크롤러 환경설정 사용)’ 이어야 합니다. ‘미리보기’로 두면 파일만 만들고 발송하지 않습니다.</w:t>
+        <w:t xml:space="preserve">메일이 실제로 나가려면 앱의 관리 → 설정 → ‘이메일 발송 방식’이 ‘자동(크롤러 환경설정 사용)’ 이어야 합니다. ‘미리보기’로 두면 파일만 만들고 발송하지 않습니다. SMTP가 일시적으로 실패하면 발송 작업을 남겨 다음 크롤링 때 자동으로 다시 시도합니다.</w:t>
       </w:r>
     </w:p>
     <w:p>

</xml_diff>